<commit_message>
Update unified guide with Gmail OAuth instructions
</commit_message>
<xml_diff>
--- a/AI-agenti-u-praksi-unificirani-vodic.docx
+++ b/AI-agenti-u-praksi-unificirani-vodic.docx
@@ -304,11 +304,7 @@
     </w:p>
     <w:p>
       <w:r>
-        <w:rPr>
-          <w:color w:val="708090"/>
-          <w:sz w:val="18"/>
-        </w:rPr>
-        <w:t>Provjereno: 9. kolovoza 2026.  |  Jezik: hrvatski</w:t>
+        <w:t>Provjereno: 21. kolovoza 2026. | Jezik: hrvatski</w:t>
       </w:r>
     </w:p>
     <w:p>
@@ -1255,7 +1251,7 @@
         <w:pStyle w:val="ListNumber"/>
       </w:pPr>
       <w:r>
-        <w:t>Dodajte credentials.json i upišite OPENAI_API_KEY u .env.</w:t>
+        <w:t>Dodajte credentials.json prema detaljnom postupku u odjeljku 4.2 i upišite OPENAI_API_KEY u .env.</w:t>
       </w:r>
     </w:p>
     <w:p>
@@ -4752,11 +4748,9 @@
       </w:r>
     </w:p>
     <w:p>
-      <w:pPr>
-        <w:pStyle w:val="ListNumber"/>
-      </w:pPr>
-      <w:r>
-        <w:t>Uključite Gmail API i dovršite OAuth consent screen kao u n8n postupku.</w:t>
+      <w:pPr/>
+      <w:r>
+        <w:t>`credentials.json` nije Gmail lozinka niti korisnički OAuth token. To je JSON datoteka s identitetom OAuth klijenta (`client_id` i `client_secret`) koji izradite u Google Cloudu. Korisnik se zasebno prijavljuje u Google i odobrava pristup Gmailu.</w:t>
       </w:r>
     </w:p>
     <w:p>
@@ -4764,7 +4758,7 @@
         <w:pStyle w:val="ListNumber"/>
       </w:pPr>
       <w:r>
-        <w:t>Izradite zaseban OAuth Client ID tipa Desktop app.</w:t>
+        <w:t>Otvorite Google Cloud Console, izradite novi projekt ili odaberite postojeći projekt namijenjen ovom agentu, a zatim u APIs &amp; Services → Library uključite Gmail API.</w:t>
       </w:r>
     </w:p>
     <w:p>
@@ -4772,7 +4766,7 @@
         <w:pStyle w:val="ListNumber"/>
       </w:pPr>
       <w:r>
-        <w:t>Preuzetu datoteku preimenujte u credentials.json i stavite u korijen inbox-agent projekta.</w:t>
+        <w:t>U Google Auth Platform → Branding postavite barem App name, User support email i Developer contact information.</w:t>
       </w:r>
     </w:p>
     <w:p>
@@ -4780,12 +4774,123 @@
         <w:pStyle w:val="ListNumber"/>
       </w:pPr>
       <w:r>
-        <w:t>Prvo pokretanje otvorit će preglednik. Prijavite se na račun koji želite obrađivati i odobrite pristup.</w:t>
+        <w:t>U Google Auth Platform → Audience za osobni Gmail račun odaberite External. Za Google Workspace projekt koji koriste samo članovi iste organizacije možete odabrati Internal, ako je ta mogućnost dostupna.</w:t>
       </w:r>
     </w:p>
     <w:p>
-      <w:r>
-        <w:t>Projekt traži gmail.modify i gmail.compose. Googleov compose scope tehnički obuhvaća i slanje, ali kod namjerno nema metodu niti granu koja šalje poruku. To je važno provjeriti pri svakom budućem code reviewu.</w:t>
+      <w:pPr>
+        <w:pStyle w:val="ListNumber"/>
+      </w:pPr>
+      <w:r>
+        <w:t>Ako koristite External i aplikacija je u statusu Testing, u Audience → Test users dodajte Gmail račun kojim ćete pokretati agenta. Bez toga autorizacija testnog korisnika može biti odbijena.</w:t>
+      </w:r>
+    </w:p>
+    <w:p>
+      <w:pPr>
+        <w:pStyle w:val="ListNumber"/>
+      </w:pPr>
+      <w:r>
+        <w:t>U Google Auth Platform → Data Access dodajte scopeove koje ova implementacija traži:</w:t>
+      </w:r>
+    </w:p>
+    <w:p>
+      <w:pPr>
+        <w:pStyle w:val="Code"/>
+      </w:pPr>
+      <w:r>
+        <w:t>https://www.googleapis.com/auth/gmail.modify</w:t>
+        <w:br/>
+        <w:t>https://www.googleapis.com/auth/gmail.compose</w:t>
+      </w:r>
+    </w:p>
+    <w:p>
+      <w:pPr/>
+      <w:r>
+        <w:t>Google oba scopea klasificira kao Restricted. gmail.modify omogućuje čitanje i izmjenu poruka, a gmail.compose upravljanje skicama. Scope compose tehnički dopušta i slanje, ali ovaj projekt namjerno nema metodu koja poziva Gmail API za slanje poruke.</w:t>
+      </w:r>
+    </w:p>
+    <w:p>
+      <w:pPr>
+        <w:pStyle w:val="ListNumber"/>
+      </w:pPr>
+      <w:r>
+        <w:t>Otvorite Google Auth Platform → Clients → Create Client, odaberite Application type: Desktop app i zadajte prepoznatljiv naziv, primjerice AI Inbox Agent Windows.</w:t>
+      </w:r>
+    </w:p>
+    <w:p>
+      <w:pPr/>
+      <w:r>
+        <w:t>Za Desktop app ne upisujete ručno redirect URI. Kod koristi InstalledAppFlow.run_local_server(port=0), pa pri prvom pokretanju otvara privremeni lokalni HTTP callback na slobodnom portu i zatim zadani web-preglednik.</w:t>
+      </w:r>
+    </w:p>
+    <w:p>
+      <w:pPr>
+        <w:pStyle w:val="ListNumber"/>
+      </w:pPr>
+      <w:r>
+        <w:t>Preuzmite JSON OAuth klijenta, preimenujte ga u credentials.json i kopirajte izravno u mapu inbox-agent.</w:t>
+      </w:r>
+    </w:p>
+    <w:p>
+      <w:pPr>
+        <w:pStyle w:val="Code"/>
+      </w:pPr>
+      <w:r>
+        <w:t>inbox-agent\</w:t>
+        <w:br/>
+        <w:t xml:space="preserve">  credentials.json</w:t>
+        <w:br/>
+        <w:t xml:space="preserve">  .env</w:t>
+        <w:br/>
+        <w:t xml:space="preserve">  run-windows.ps1</w:t>
+        <w:br/>
+        <w:t xml:space="preserve">  setup-windows.ps1</w:t>
+        <w:br/>
+        <w:t xml:space="preserve">  register-task-windows.ps1</w:t>
+      </w:r>
+    </w:p>
+    <w:p>
+      <w:pPr>
+        <w:pStyle w:val="Callout"/>
+      </w:pPr>
+      <w:r>
+        <w:t>Tajne. credentials.json, .env i .data/token.json ne smiju u Git. Projektni .gitignore ih već isključuje, ali prije commita svejedno provjerite git status.</w:t>
+      </w:r>
+    </w:p>
+    <w:p>
+      <w:pPr>
+        <w:pStyle w:val="ListNumber"/>
+      </w:pPr>
+      <w:r>
+        <w:t>Prvo interaktivno pokretanje napravite s .\run-windows.ps1. To je dry-run. Ako .data/token.json još ne postoji, otvorit će se preglednik; prijavite se Gmail računom iz Test users, pregledajte dozvole i potvrdite pristup.</w:t>
+      </w:r>
+    </w:p>
+    <w:p>
+      <w:pPr/>
+      <w:r>
+        <w:t>Nakon uspješne autorizacije aplikacija sprema korisnički OAuth token u inbox-agent\.data\token.json. Pri kasnijim pokretanjima koristi refresh token i po potrebi automatski obnavlja kratkotrajni access token.</w:t>
+      </w:r>
+    </w:p>
+    <w:p>
+      <w:pPr>
+        <w:pStyle w:val="Callout"/>
+      </w:pPr>
+      <w:r>
+        <w:t>External + Testing. Google za External OAuth projekt u statusu Testing, kada se traže Gmail scopeovi izvan osnovnih openid/profile/email scopeova, u pravilu izdaje refresh token koji istječe nakon 7 dana. To je važno za Scheduled Task: nakon isteka potrebno je ponovno interaktivno autorizirati račun ili urediti publishing/verifikacijski status aplikacije u skladu s Googleovim pravilima.</w:t>
+      </w:r>
+    </w:p>
+    <w:p>
+      <w:pPr>
+        <w:pStyle w:val="ListNumber"/>
+      </w:pPr>
+      <w:r>
+        <w:t>Izbrišite .data/token.json i ponovite OAuth autorizaciju ako promijenite credentials.json odnosno OAuth Client ID, promijenite tražene scopeove, želite koristiti drugi Gmail račun ili Google vrati invalid_grant / korisnik opozove pristup.</w:t>
+      </w:r>
+    </w:p>
+    <w:p>
+      <w:pPr/>
+      <w:r>
+        <w:t>credentials.json i token.json nisu isto: prvi identificira vašu aplikaciju, a drugi predstavlja odobrenje konkretnog Gmail korisnika. token.json nemojte kopirati na druga računala niti dijeliti s drugim korisnicima.</w:t>
       </w:r>
     </w:p>
     <w:p>
@@ -7659,6 +7764,30 @@
     </w:p>
     <w:p>
       <w:pPr>
+        <w:pStyle w:val="ListBullet"/>
+      </w:pPr>
+      <w:r>
+        <w:t>Google Workspace: Gmail API Python quickstart — https://developers.google.com/workspace/gmail/api/quickstart/python</w:t>
+      </w:r>
+    </w:p>
+    <w:p>
+      <w:pPr>
+        <w:pStyle w:val="ListBullet"/>
+      </w:pPr>
+      <w:r>
+        <w:t>Gmail API: OAuth scopeovi — https://developers.google.com/workspace/gmail/api/auth/scopes</w:t>
+      </w:r>
+    </w:p>
+    <w:p>
+      <w:pPr>
+        <w:pStyle w:val="ListBullet"/>
+      </w:pPr>
+      <w:r>
+        <w:t>Google Identity: OAuth 2.0 i istek refresh tokena — https://developers.google.com/identity/protocols/oauth2#expiration</w:t>
+      </w:r>
+    </w:p>
+    <w:p>
+      <w:pPr>
         <w:pStyle w:val="Heading2"/>
       </w:pPr>
       <w:r>

</xml_diff>

<commit_message>
Finalize Gmail OAuth guide formatting
</commit_message>
<xml_diff>
--- a/AI-agenti-u-praksi-unificirani-vodic.docx
+++ b/AI-agenti-u-praksi-unificirani-vodic.docx
@@ -4750,7 +4750,7 @@
     <w:p>
       <w:pPr/>
       <w:r>
-        <w:t>`credentials.json` nije Gmail lozinka niti korisnički OAuth token. To je JSON datoteka s identitetom OAuth klijenta (`client_id` i `client_secret`) koji izradite u Google Cloudu. Korisnik se zasebno prijavljuje u Google i odobrava pristup Gmailu.</w:t>
+        <w:t>credentials.json nije Gmail lozinka niti korisnički OAuth token. To je JSON datoteka s identitetom OAuth klijenta (client_id i client_secret) koji izradite u Google Cloudu. Korisnik se zasebno prijavljuje u Google i odobrava pristup Gmailu.</w:t>
       </w:r>
     </w:p>
     <w:p>
@@ -4796,6 +4796,10 @@
     <w:p>
       <w:pPr>
         <w:pStyle w:val="Code"/>
+        <w:shd w:fill="F3F5F7"/>
+        <w:pBdr>
+          <w:left w:val="single" w:sz="18" w:space="5" w:color="2E74B5"/>
+        </w:pBdr>
       </w:pPr>
       <w:r>
         <w:t>https://www.googleapis.com/auth/gmail.modify</w:t>
@@ -4834,6 +4838,10 @@
     <w:p>
       <w:pPr>
         <w:pStyle w:val="Code"/>
+        <w:shd w:fill="F3F5F7"/>
+        <w:pBdr>
+          <w:left w:val="single" w:sz="18" w:space="5" w:color="2E74B5"/>
+        </w:pBdr>
       </w:pPr>
       <w:r>
         <w:t>inbox-agent\</w:t>
@@ -4852,9 +4860,19 @@
     <w:p>
       <w:pPr>
         <w:pStyle w:val="Callout"/>
-      </w:pPr>
-      <w:r>
-        <w:t>Tajne. credentials.json, .env i .data/token.json ne smiju u Git. Projektni .gitignore ih već isključuje, ali prije commita svejedno provjerite git status.</w:t>
+        <w:shd w:fill="FFF4CC"/>
+        <w:pBdr>
+          <w:left w:val="single" w:sz="18" w:space="5" w:color="2E74B5"/>
+        </w:pBdr>
+      </w:pPr>
+      <w:r>
+        <w:rPr>
+          <w:b/>
+        </w:rPr>
+        <w:t xml:space="preserve">Tajne. </w:t>
+      </w:r>
+      <w:r>
+        <w:t>credentials.json, .env i .data/token.json ne smiju u Git. Projektni .gitignore ih već isključuje, ali prije commita svejedno provjerite git status.</w:t>
       </w:r>
     </w:p>
     <w:p>
@@ -4874,9 +4892,19 @@
     <w:p>
       <w:pPr>
         <w:pStyle w:val="Callout"/>
-      </w:pPr>
-      <w:r>
-        <w:t>External + Testing. Google za External OAuth projekt u statusu Testing, kada se traže Gmail scopeovi izvan osnovnih openid/profile/email scopeova, u pravilu izdaje refresh token koji istječe nakon 7 dana. To je važno za Scheduled Task: nakon isteka potrebno je ponovno interaktivno autorizirati račun ili urediti publishing/verifikacijski status aplikacije u skladu s Googleovim pravilima.</w:t>
+        <w:shd w:fill="FFF4CC"/>
+        <w:pBdr>
+          <w:left w:val="single" w:sz="18" w:space="5" w:color="2E74B5"/>
+        </w:pBdr>
+      </w:pPr>
+      <w:r>
+        <w:rPr>
+          <w:b/>
+        </w:rPr>
+        <w:t xml:space="preserve">External </w:t>
+      </w:r>
+      <w:r>
+        <w:t>+ Testing. Google za External OAuth projekt u statusu Testing, kada se traže Gmail scopeovi izvan osnovnih openid/profile/email scopeova, u pravilu izdaje refresh token koji istječe nakon 7 dana. To je važno za Scheduled Task: nakon isteka potrebno je ponovno interaktivno autorizirati račun ili urediti publishing/verifikacijski status aplikacije u skladu s Googleovim pravilima.</w:t>
       </w:r>
     </w:p>
     <w:p>
@@ -7767,24 +7795,51 @@
         <w:pStyle w:val="ListBullet"/>
       </w:pPr>
       <w:r>
-        <w:t>Google Workspace: Gmail API Python quickstart — https://developers.google.com/workspace/gmail/api/quickstart/python</w:t>
-      </w:r>
+        <w:t xml:space="preserve">Google Workspace: Gmail API Python quickstart — </w:t>
+      </w:r>
+      <w:hyperlink r:id="rId31">
+        <w:r>
+          <w:rPr>
+            <w:color w:val="0563C1"/>
+            <w:u w:val="single"/>
+          </w:rPr>
+          <w:t>https://developers.google.com/workspace/gmail/api/quickstart/python</w:t>
+        </w:r>
+      </w:hyperlink>
     </w:p>
     <w:p>
       <w:pPr>
         <w:pStyle w:val="ListBullet"/>
       </w:pPr>
       <w:r>
-        <w:t>Gmail API: OAuth scopeovi — https://developers.google.com/workspace/gmail/api/auth/scopes</w:t>
-      </w:r>
+        <w:t xml:space="preserve">Gmail API: OAuth scopeovi — </w:t>
+      </w:r>
+      <w:hyperlink r:id="rId32">
+        <w:r>
+          <w:rPr>
+            <w:color w:val="0563C1"/>
+            <w:u w:val="single"/>
+          </w:rPr>
+          <w:t>https://developers.google.com/workspace/gmail/api/auth/scopes</w:t>
+        </w:r>
+      </w:hyperlink>
     </w:p>
     <w:p>
       <w:pPr>
         <w:pStyle w:val="ListBullet"/>
       </w:pPr>
       <w:r>
-        <w:t>Google Identity: OAuth 2.0 i istek refresh tokena — https://developers.google.com/identity/protocols/oauth2#expiration</w:t>
-      </w:r>
+        <w:t xml:space="preserve">Google Identity: OAuth 2.0 i istek refresh tokena — </w:t>
+      </w:r>
+      <w:hyperlink r:id="rId33">
+        <w:r>
+          <w:rPr>
+            <w:color w:val="0563C1"/>
+            <w:u w:val="single"/>
+          </w:rPr>
+          <w:t>https://developers.google.com/identity/protocols/oauth2#expiration</w:t>
+        </w:r>
+      </w:hyperlink>
     </w:p>
     <w:p>
       <w:pPr>

</xml_diff>